<commit_message>
updated positions of Cane Ridge, added copyright note
</commit_message>
<xml_diff>
--- a/Images/Church Diagrams/Word Documents/Cane Ridge Diagram.docx
+++ b/Images/Church Diagrams/Word Documents/Cane Ridge Diagram.docx
@@ -1785,16 +1785,16 @@
         <mc:AlternateContent>
           <mc:Choice Requires="wps">
             <w:drawing>
-              <wp:anchor distT="0" distB="0" distL="114300" distR="114300" simplePos="0" relativeHeight="251772928" behindDoc="0" locked="0" layoutInCell="1" allowOverlap="1" wp14:anchorId="2291DC22" wp14:editId="5C9E0537">
+              <wp:anchor distT="0" distB="0" distL="114300" distR="114300" simplePos="0" relativeHeight="251772928" behindDoc="0" locked="0" layoutInCell="1" allowOverlap="1" wp14:anchorId="2291DC22" wp14:editId="599EF606">
                 <wp:simplePos x="0" y="0"/>
                 <wp:positionH relativeFrom="column">
-                  <wp:posOffset>3024744</wp:posOffset>
+                  <wp:posOffset>2992120</wp:posOffset>
                 </wp:positionH>
                 <wp:positionV relativeFrom="paragraph">
-                  <wp:posOffset>136208</wp:posOffset>
+                  <wp:posOffset>154387</wp:posOffset>
                 </wp:positionV>
-                <wp:extent cx="316865" cy="909726"/>
-                <wp:effectExtent l="8573" t="16827" r="9207" b="9208"/>
+                <wp:extent cx="316865" cy="848257"/>
+                <wp:effectExtent l="13970" t="11430" r="14605" b="14605"/>
                 <wp:wrapNone/>
                 <wp:docPr id="1220452167" name="Delay 5"/>
                 <wp:cNvGraphicFramePr/>
@@ -1805,7 +1805,7 @@
                       <wps:spPr>
                         <a:xfrm rot="16200000" flipV="1">
                           <a:off x="0" y="0"/>
-                          <a:ext cx="316865" cy="909726"/>
+                          <a:ext cx="316865" cy="848257"/>
                         </a:xfrm>
                         <a:prstGeom prst="flowChartDelay">
                           <a:avLst/>
@@ -1853,11 +1853,11 @@
           </mc:Choice>
           <mc:Fallback>
             <w:pict>
-              <v:shapetype w14:anchorId="6C10F0A6" id="_x0000_t135" coordsize="21600,21600" o:spt="135" path="m10800,qx21600,10800,10800,21600l,21600,,xe">
+              <v:shapetype w14:anchorId="609AAF89" id="_x0000_t135" coordsize="21600,21600" o:spt="135" path="m10800,qx21600,10800,10800,21600l,21600,,xe">
                 <v:stroke joinstyle="miter"/>
                 <v:path gradientshapeok="t" o:connecttype="rect" textboxrect="0,3163,18437,18437"/>
               </v:shapetype>
-              <v:shape id="Delay 5" o:spid="_x0000_s1026" type="#_x0000_t135" style="position:absolute;margin-left:238.15pt;margin-top:10.75pt;width:24.95pt;height:71.65pt;rotation:90;flip:y;z-index:251772928;visibility:visible;mso-wrap-style:square;mso-width-percent:0;mso-height-percent:0;mso-wrap-distance-left:9pt;mso-wrap-distance-top:0;mso-wrap-distance-right:9pt;mso-wrap-distance-bottom:0;mso-position-horizontal:absolute;mso-position-horizontal-relative:text;mso-position-vertical:absolute;mso-position-vertical-relative:text;mso-width-percent:0;mso-height-percent:0;mso-width-relative:margin;mso-height-relative:margin;v-text-anchor:middle" o:gfxdata="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" filled="f" strokecolor="black [3213]" strokeweight="1.5pt"/>
+              <v:shape id="Delay 5" o:spid="_x0000_s1026" type="#_x0000_t135" style="position:absolute;margin-left:235.6pt;margin-top:12.15pt;width:24.95pt;height:66.8pt;rotation:90;flip:y;z-index:251772928;visibility:visible;mso-wrap-style:square;mso-width-percent:0;mso-height-percent:0;mso-wrap-distance-left:9pt;mso-wrap-distance-top:0;mso-wrap-distance-right:9pt;mso-wrap-distance-bottom:0;mso-position-horizontal:absolute;mso-position-horizontal-relative:text;mso-position-vertical:absolute;mso-position-vertical-relative:text;mso-width-percent:0;mso-height-percent:0;mso-width-relative:margin;mso-height-relative:margin;v-text-anchor:middle" o:gfxdata="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" filled="f" strokecolor="black [3213]" strokeweight="1.5pt"/>
             </w:pict>
           </mc:Fallback>
         </mc:AlternateContent>
@@ -1872,18 +1872,18 @@
         <mc:AlternateContent>
           <mc:Choice Requires="wps">
             <w:drawing>
-              <wp:anchor distT="0" distB="0" distL="114300" distR="114300" simplePos="0" relativeHeight="251716608" behindDoc="0" locked="0" layoutInCell="1" allowOverlap="1" wp14:anchorId="1A9E2FD3" wp14:editId="3EF25B32">
+              <wp:anchor distT="0" distB="0" distL="114300" distR="114300" simplePos="0" relativeHeight="251718656" behindDoc="0" locked="0" layoutInCell="1" allowOverlap="1" wp14:anchorId="1A9E2FD3" wp14:editId="48685F1E">
                 <wp:simplePos x="0" y="0"/>
                 <wp:positionH relativeFrom="column">
-                  <wp:posOffset>3262877</wp:posOffset>
+                  <wp:posOffset>3255957</wp:posOffset>
                 </wp:positionH>
                 <wp:positionV relativeFrom="paragraph">
-                  <wp:posOffset>104437</wp:posOffset>
+                  <wp:posOffset>104650</wp:posOffset>
                 </wp:positionV>
                 <wp:extent cx="349841" cy="239843"/>
                 <wp:effectExtent l="0" t="0" r="6350" b="1905"/>
                 <wp:wrapNone/>
-                <wp:docPr id="1302336973" name="Text Box 12"/>
+                <wp:docPr id="1157648755" name="Text Box 12"/>
                 <wp:cNvGraphicFramePr/>
                 <a:graphic xmlns:a="http://schemas.openxmlformats.org/drawingml/2006/main">
                   <a:graphicData uri="http://schemas.microsoft.com/office/word/2010/wordprocessingShape">
@@ -1921,7 +1921,15 @@
                                 <w:sz w:val="20"/>
                                 <w:szCs w:val="20"/>
                               </w:rPr>
-                              <w:t>R4</w:t>
+                              <w:t>R</w:t>
+                            </w:r>
+                            <w:r>
+                              <w:rPr>
+                                <w:rFonts w:ascii="Times New Roman" w:hAnsi="Times New Roman" w:cs="Times New Roman"/>
+                                <w:sz w:val="20"/>
+                                <w:szCs w:val="20"/>
+                              </w:rPr>
+                              <w:t>5</w:t>
                             </w:r>
                           </w:p>
                         </w:txbxContent>
@@ -1946,7 +1954,11 @@
           </mc:Choice>
           <mc:Fallback>
             <w:pict>
-              <v:shape w14:anchorId="1A9E2FD3" id="Text Box 12" o:spid="_x0000_s1028" type="#_x0000_t202" style="position:absolute;margin-left:256.9pt;margin-top:8.2pt;width:27.55pt;height:18.9pt;z-index:251716608;visibility:visible;mso-wrap-style:square;mso-width-percent:0;mso-height-percent:0;mso-wrap-distance-left:9pt;mso-wrap-distance-top:0;mso-wrap-distance-right:9pt;mso-wrap-distance-bottom:0;mso-position-horizontal:absolute;mso-position-horizontal-relative:text;mso-position-vertical:absolute;mso-position-vertical-relative:text;mso-width-percent:0;mso-height-percent:0;mso-width-relative:margin;mso-height-relative:margin;v-text-anchor:top" o:gfxdata="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" fillcolor="white [3201]" stroked="f" strokeweight=".5pt">
+              <v:shapetype w14:anchorId="1A9E2FD3" id="_x0000_t202" coordsize="21600,21600" o:spt="202" path="m,l,21600r21600,l21600,xe">
+                <v:stroke joinstyle="miter"/>
+                <v:path gradientshapeok="t" o:connecttype="rect"/>
+              </v:shapetype>
+              <v:shape id="Text Box 12" o:spid="_x0000_s1028" type="#_x0000_t202" style="position:absolute;margin-left:256.35pt;margin-top:8.25pt;width:27.55pt;height:18.9pt;z-index:251718656;visibility:visible;mso-wrap-style:square;mso-width-percent:0;mso-height-percent:0;mso-wrap-distance-left:9pt;mso-wrap-distance-top:0;mso-wrap-distance-right:9pt;mso-wrap-distance-bottom:0;mso-position-horizontal:absolute;mso-position-horizontal-relative:text;mso-position-vertical:absolute;mso-position-vertical-relative:text;mso-width-percent:0;mso-height-percent:0;mso-width-relative:margin;mso-height-relative:margin;v-text-anchor:top" o:gfxdata="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" fillcolor="white [3201]" stroked="f" strokeweight=".5pt">
                 <v:textbox>
                   <w:txbxContent>
                     <w:p>
@@ -1964,7 +1976,15 @@
                           <w:sz w:val="20"/>
                           <w:szCs w:val="20"/>
                         </w:rPr>
-                        <w:t>R4</w:t>
+                        <w:t>R</w:t>
+                      </w:r>
+                      <w:r>
+                        <w:rPr>
+                          <w:rFonts w:ascii="Times New Roman" w:hAnsi="Times New Roman" w:cs="Times New Roman"/>
+                          <w:sz w:val="20"/>
+                          <w:szCs w:val="20"/>
+                        </w:rPr>
+                        <w:t>5</w:t>
                       </w:r>
                     </w:p>
                   </w:txbxContent>
@@ -2069,6 +2089,115 @@
       <w:pPr>
         <w:ind w:left="2160" w:firstLine="720"/>
       </w:pPr>
+      <w:r>
+        <w:rPr>
+          <w:noProof/>
+        </w:rPr>
+        <mc:AlternateContent>
+          <mc:Choice Requires="wps">
+            <w:drawing>
+              <wp:anchor distT="0" distB="0" distL="114300" distR="114300" simplePos="0" relativeHeight="251716608" behindDoc="0" locked="0" layoutInCell="1" allowOverlap="1" wp14:anchorId="1A9E2FD3" wp14:editId="6E0A14DC">
+                <wp:simplePos x="0" y="0"/>
+                <wp:positionH relativeFrom="column">
+                  <wp:posOffset>3285500</wp:posOffset>
+                </wp:positionH>
+                <wp:positionV relativeFrom="paragraph">
+                  <wp:posOffset>2060439</wp:posOffset>
+                </wp:positionV>
+                <wp:extent cx="349841" cy="239843"/>
+                <wp:effectExtent l="0" t="0" r="6350" b="1905"/>
+                <wp:wrapNone/>
+                <wp:docPr id="1302336973" name="Text Box 12"/>
+                <wp:cNvGraphicFramePr/>
+                <a:graphic xmlns:a="http://schemas.openxmlformats.org/drawingml/2006/main">
+                  <a:graphicData uri="http://schemas.microsoft.com/office/word/2010/wordprocessingShape">
+                    <wps:wsp>
+                      <wps:cNvSpPr txBox="1"/>
+                      <wps:spPr>
+                        <a:xfrm>
+                          <a:off x="0" y="0"/>
+                          <a:ext cx="349841" cy="239843"/>
+                        </a:xfrm>
+                        <a:prstGeom prst="rect">
+                          <a:avLst/>
+                        </a:prstGeom>
+                        <a:solidFill>
+                          <a:schemeClr val="lt1"/>
+                        </a:solidFill>
+                        <a:ln w="6350">
+                          <a:noFill/>
+                        </a:ln>
+                      </wps:spPr>
+                      <wps:txbx>
+                        <w:txbxContent>
+                          <w:p>
+                            <w:pPr>
+                              <w:jc w:val="center"/>
+                              <w:rPr>
+                                <w:rFonts w:ascii="Times New Roman" w:hAnsi="Times New Roman" w:cs="Times New Roman"/>
+                                <w:sz w:val="20"/>
+                                <w:szCs w:val="20"/>
+                              </w:rPr>
+                            </w:pPr>
+                            <w:r>
+                              <w:rPr>
+                                <w:rFonts w:ascii="Times New Roman" w:hAnsi="Times New Roman" w:cs="Times New Roman"/>
+                                <w:sz w:val="20"/>
+                                <w:szCs w:val="20"/>
+                              </w:rPr>
+                              <w:t>R4</w:t>
+                            </w:r>
+                          </w:p>
+                        </w:txbxContent>
+                      </wps:txbx>
+                      <wps:bodyPr rot="0" spcFirstLastPara="0" vertOverflow="overflow" horzOverflow="overflow" vert="horz" wrap="square" lIns="91440" tIns="45720" rIns="91440" bIns="45720" numCol="1" spcCol="0" rtlCol="0" fromWordArt="0" anchor="t" anchorCtr="0" forceAA="0" compatLnSpc="1">
+                        <a:prstTxWarp prst="textNoShape">
+                          <a:avLst/>
+                        </a:prstTxWarp>
+                        <a:noAutofit/>
+                      </wps:bodyPr>
+                    </wps:wsp>
+                  </a:graphicData>
+                </a:graphic>
+                <wp14:sizeRelH relativeFrom="margin">
+                  <wp14:pctWidth>0</wp14:pctWidth>
+                </wp14:sizeRelH>
+                <wp14:sizeRelV relativeFrom="margin">
+                  <wp14:pctHeight>0</wp14:pctHeight>
+                </wp14:sizeRelV>
+              </wp:anchor>
+            </w:drawing>
+          </mc:Choice>
+          <mc:Fallback>
+            <w:pict>
+              <v:shape w14:anchorId="1A9E2FD3" id="_x0000_s1029" type="#_x0000_t202" style="position:absolute;left:0;text-align:left;margin-left:258.7pt;margin-top:162.25pt;width:27.55pt;height:18.9pt;z-index:251716608;visibility:visible;mso-wrap-style:square;mso-width-percent:0;mso-height-percent:0;mso-wrap-distance-left:9pt;mso-wrap-distance-top:0;mso-wrap-distance-right:9pt;mso-wrap-distance-bottom:0;mso-position-horizontal:absolute;mso-position-horizontal-relative:text;mso-position-vertical:absolute;mso-position-vertical-relative:text;mso-width-percent:0;mso-height-percent:0;mso-width-relative:margin;mso-height-relative:margin;v-text-anchor:top" o:gfxdata="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" fillcolor="white [3201]" stroked="f" strokeweight=".5pt">
+                <v:textbox>
+                  <w:txbxContent>
+                    <w:p>
+                      <w:pPr>
+                        <w:jc w:val="center"/>
+                        <w:rPr>
+                          <w:rFonts w:ascii="Times New Roman" w:hAnsi="Times New Roman" w:cs="Times New Roman"/>
+                          <w:sz w:val="20"/>
+                          <w:szCs w:val="20"/>
+                        </w:rPr>
+                      </w:pPr>
+                      <w:r>
+                        <w:rPr>
+                          <w:rFonts w:ascii="Times New Roman" w:hAnsi="Times New Roman" w:cs="Times New Roman"/>
+                          <w:sz w:val="20"/>
+                          <w:szCs w:val="20"/>
+                        </w:rPr>
+                        <w:t>R4</w:t>
+                      </w:r>
+                    </w:p>
+                  </w:txbxContent>
+                </v:textbox>
+              </v:shape>
+            </w:pict>
+          </mc:Fallback>
+        </mc:AlternateContent>
+      </w:r>
       <w:r>
         <w:rPr>
           <w:noProof/>
@@ -3094,7 +3223,7 @@
         <mc:AlternateContent>
           <mc:Choice Requires="wps">
             <w:drawing>
-              <wp:anchor distT="0" distB="0" distL="114300" distR="114300" simplePos="0" relativeHeight="251714560" behindDoc="0" locked="0" layoutInCell="1" allowOverlap="1" wp14:anchorId="1A9E2FD3" wp14:editId="5221B27E">
+              <wp:anchor distT="0" distB="0" distL="114300" distR="114300" simplePos="0" relativeHeight="251714560" behindDoc="0" locked="0" layoutInCell="1" allowOverlap="1" wp14:anchorId="1A9E2FD3" wp14:editId="07114248">
                 <wp:simplePos x="0" y="0"/>
                 <wp:positionH relativeFrom="column">
                   <wp:posOffset>2693387</wp:posOffset>
@@ -3168,7 +3297,7 @@
           </mc:Choice>
           <mc:Fallback>
             <w:pict>
-              <v:shape w14:anchorId="1A9E2FD3" id="_x0000_s1033" type="#_x0000_t202" style="position:absolute;left:0;text-align:left;margin-left:212.1pt;margin-top:9.45pt;width:28.1pt;height:18.9pt;z-index:251714560;visibility:visible;mso-wrap-style:square;mso-width-percent:0;mso-height-percent:0;mso-wrap-distance-left:9pt;mso-wrap-distance-top:0;mso-wrap-distance-right:9pt;mso-wrap-distance-bottom:0;mso-position-horizontal:absolute;mso-position-horizontal-relative:text;mso-position-vertical:absolute;mso-position-vertical-relative:text;mso-width-percent:0;mso-height-percent:0;mso-width-relative:margin;mso-height-relative:margin;v-text-anchor:top" o:gfxdata="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" fillcolor="white [3201]" stroked="f" strokeweight=".5pt">
+              <v:shape w14:anchorId="1A9E2FD3" id="_x0000_s1034" type="#_x0000_t202" style="position:absolute;left:0;text-align:left;margin-left:212.1pt;margin-top:9.45pt;width:28.1pt;height:18.9pt;z-index:251714560;visibility:visible;mso-wrap-style:square;mso-width-percent:0;mso-height-percent:0;mso-wrap-distance-left:9pt;mso-wrap-distance-top:0;mso-wrap-distance-right:9pt;mso-wrap-distance-bottom:0;mso-position-horizontal:absolute;mso-position-horizontal-relative:text;mso-position-vertical:absolute;mso-position-vertical-relative:text;mso-width-percent:0;mso-height-percent:0;mso-width-relative:margin;mso-height-relative:margin;v-text-anchor:top" o:gfxdata="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" fillcolor="white [3201]" stroked="f" strokeweight=".5pt">
                 <v:textbox>
                   <w:txbxContent>
                     <w:p>
@@ -3187,131 +3316,6 @@
                           <w:szCs w:val="20"/>
                         </w:rPr>
                         <w:t>R3</w:t>
-                      </w:r>
-                    </w:p>
-                  </w:txbxContent>
-                </v:textbox>
-              </v:shape>
-            </w:pict>
-          </mc:Fallback>
-        </mc:AlternateContent>
-      </w:r>
-      <w:r>
-        <w:rPr>
-          <w:noProof/>
-        </w:rPr>
-        <mc:AlternateContent>
-          <mc:Choice Requires="wps">
-            <w:drawing>
-              <wp:anchor distT="0" distB="0" distL="114300" distR="114300" simplePos="0" relativeHeight="251718656" behindDoc="0" locked="0" layoutInCell="1" allowOverlap="1" wp14:anchorId="1A9E2FD3" wp14:editId="06AAED4A">
-                <wp:simplePos x="0" y="0"/>
-                <wp:positionH relativeFrom="column">
-                  <wp:posOffset>3290228</wp:posOffset>
-                </wp:positionH>
-                <wp:positionV relativeFrom="paragraph">
-                  <wp:posOffset>2080255</wp:posOffset>
-                </wp:positionV>
-                <wp:extent cx="349841" cy="239843"/>
-                <wp:effectExtent l="0" t="0" r="6350" b="1905"/>
-                <wp:wrapNone/>
-                <wp:docPr id="1157648755" name="Text Box 12"/>
-                <wp:cNvGraphicFramePr/>
-                <a:graphic xmlns:a="http://schemas.openxmlformats.org/drawingml/2006/main">
-                  <a:graphicData uri="http://schemas.microsoft.com/office/word/2010/wordprocessingShape">
-                    <wps:wsp>
-                      <wps:cNvSpPr txBox="1"/>
-                      <wps:spPr>
-                        <a:xfrm>
-                          <a:off x="0" y="0"/>
-                          <a:ext cx="349841" cy="239843"/>
-                        </a:xfrm>
-                        <a:prstGeom prst="rect">
-                          <a:avLst/>
-                        </a:prstGeom>
-                        <a:solidFill>
-                          <a:schemeClr val="lt1"/>
-                        </a:solidFill>
-                        <a:ln w="6350">
-                          <a:noFill/>
-                        </a:ln>
-                      </wps:spPr>
-                      <wps:txbx>
-                        <w:txbxContent>
-                          <w:p>
-                            <w:pPr>
-                              <w:jc w:val="center"/>
-                              <w:rPr>
-                                <w:rFonts w:ascii="Times New Roman" w:hAnsi="Times New Roman" w:cs="Times New Roman"/>
-                                <w:sz w:val="20"/>
-                                <w:szCs w:val="20"/>
-                              </w:rPr>
-                            </w:pPr>
-                            <w:r>
-                              <w:rPr>
-                                <w:rFonts w:ascii="Times New Roman" w:hAnsi="Times New Roman" w:cs="Times New Roman"/>
-                                <w:sz w:val="20"/>
-                                <w:szCs w:val="20"/>
-                              </w:rPr>
-                              <w:t>R</w:t>
-                            </w:r>
-                            <w:r>
-                              <w:rPr>
-                                <w:rFonts w:ascii="Times New Roman" w:hAnsi="Times New Roman" w:cs="Times New Roman"/>
-                                <w:sz w:val="20"/>
-                                <w:szCs w:val="20"/>
-                              </w:rPr>
-                              <w:t>5</w:t>
-                            </w:r>
-                          </w:p>
-                        </w:txbxContent>
-                      </wps:txbx>
-                      <wps:bodyPr rot="0" spcFirstLastPara="0" vertOverflow="overflow" horzOverflow="overflow" vert="horz" wrap="square" lIns="91440" tIns="45720" rIns="91440" bIns="45720" numCol="1" spcCol="0" rtlCol="0" fromWordArt="0" anchor="t" anchorCtr="0" forceAA="0" compatLnSpc="1">
-                        <a:prstTxWarp prst="textNoShape">
-                          <a:avLst/>
-                        </a:prstTxWarp>
-                        <a:noAutofit/>
-                      </wps:bodyPr>
-                    </wps:wsp>
-                  </a:graphicData>
-                </a:graphic>
-                <wp14:sizeRelH relativeFrom="margin">
-                  <wp14:pctWidth>0</wp14:pctWidth>
-                </wp14:sizeRelH>
-                <wp14:sizeRelV relativeFrom="margin">
-                  <wp14:pctHeight>0</wp14:pctHeight>
-                </wp14:sizeRelV>
-              </wp:anchor>
-            </w:drawing>
-          </mc:Choice>
-          <mc:Fallback>
-            <w:pict>
-              <v:shape w14:anchorId="1A9E2FD3" id="_x0000_s1034" type="#_x0000_t202" style="position:absolute;left:0;text-align:left;margin-left:259.05pt;margin-top:163.8pt;width:27.55pt;height:18.9pt;z-index:251718656;visibility:visible;mso-wrap-style:square;mso-width-percent:0;mso-height-percent:0;mso-wrap-distance-left:9pt;mso-wrap-distance-top:0;mso-wrap-distance-right:9pt;mso-wrap-distance-bottom:0;mso-position-horizontal:absolute;mso-position-horizontal-relative:text;mso-position-vertical:absolute;mso-position-vertical-relative:text;mso-width-percent:0;mso-height-percent:0;mso-width-relative:margin;mso-height-relative:margin;v-text-anchor:top" o:gfxdata="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" fillcolor="white [3201]" stroked="f" strokeweight=".5pt">
-                <v:textbox>
-                  <w:txbxContent>
-                    <w:p>
-                      <w:pPr>
-                        <w:jc w:val="center"/>
-                        <w:rPr>
-                          <w:rFonts w:ascii="Times New Roman" w:hAnsi="Times New Roman" w:cs="Times New Roman"/>
-                          <w:sz w:val="20"/>
-                          <w:szCs w:val="20"/>
-                        </w:rPr>
-                      </w:pPr>
-                      <w:r>
-                        <w:rPr>
-                          <w:rFonts w:ascii="Times New Roman" w:hAnsi="Times New Roman" w:cs="Times New Roman"/>
-                          <w:sz w:val="20"/>
-                          <w:szCs w:val="20"/>
-                        </w:rPr>
-                        <w:t>R</w:t>
-                      </w:r>
-                      <w:r>
-                        <w:rPr>
-                          <w:rFonts w:ascii="Times New Roman" w:hAnsi="Times New Roman" w:cs="Times New Roman"/>
-                          <w:sz w:val="20"/>
-                          <w:szCs w:val="20"/>
-                        </w:rPr>
-                        <w:t>5</w:t>
                       </w:r>
                     </w:p>
                   </w:txbxContent>

</xml_diff>